<commit_message>
Adiciona back-matter (declaracoes) aos dois papers em portugues
Secoes de back-matter exigidas pelos periodicos, com placeholders:
Contribuicoes dos autores, Financiamento, Aprovacao etica (CEP/CAAE),
Consentimento informado, Disponibilidade dos dados, Conflitos de
interesse e nota de artigo companheiro (disclosure de mesma amostra).

Adicionadas a Paper1 (humor) e Paper2 (fisiologia/bem-estar). A
separacao fisica corpo/suplementar e a numeracao de referencias serao
aplicadas na versao em ingles para submissao.

Co-Authored-By: Claude Opus 4.8 <noreply@anthropic.com>
Claude-Session: https://claude.ai/code/session_01P7yGiDeoGDyjWvPWQVsUrj
</commit_message>
<xml_diff>
--- a/Artigos/Paper1_Humor_dinamica.docx
+++ b/Artigos/Paper1_Humor_dinamica.docx
@@ -17881,6 +17881,181 @@
           <w:sz w:val="24"/>
         </w:rPr>
         <w:t>Na última semana de pré-temporada, o humor dos handebolistas transitou da prontidão para a fadiga: o vigor recuou e a fadiga avançou, do primeiro ao último dia e no interior de cada sessão, com confirmação pelas comparações entre todos os dias e pela análise multivariada. A modelagem das trajetórias situou o cruzamento entre vigor e fadiga na metade da semana e restringiu o sinal robusto ao eixo energia–fadiga, ao passo que as demais dimensões, próximas do piso, pouco informaram. O conjunto — deterioração limitada ao eixo energético, sem instalação dos perfis de risco à saúde mental e sem instalação dos perfis de maior risco à saúde mental — corresponde a um sobre-esforço funcional, ou seja, a uma fadiga esperada e reversível, própria de uma fase de acumulação. A migração do perfil iceberg para o de barbatana de tubarão, confirmada por regressão logística de tendência, e o cruzamento entre vigor e fadiga sintetizam essa dinâmica. Recomenda-se, portanto, o acompanhamento contínuo do humor na pré-temporada, com atenção primordial ao eixo energia–fadiga e à sua restauração na transição para o afinamento.</w:t>
+      </w:r>
+    </w:p>
+    <w:p>
+      <w:pPr>
+        <w:spacing w:before="200" w:after="80" w:line="360" w:lineRule="auto"/>
+      </w:pPr>
+      <w:r>
+        <w:rPr>
+          <w:b/>
+          <w:sz w:val="24"/>
+        </w:rPr>
+        <w:t>Contribuições dos autores</w:t>
+      </w:r>
+    </w:p>
+    <w:p>
+      <w:pPr>
+        <w:spacing w:line="360" w:lineRule="auto" w:after="120"/>
+        <w:jc w:val="both"/>
+      </w:pPr>
+      <w:r>
+        <w:rPr>
+          <w:b w:val="0"/>
+          <w:sz w:val="24"/>
+        </w:rPr>
+        <w:t>[Autor 1] e [Autor 2] conceberam o estudo e o delineamento. [Autor 1] conduziu a coleta de dados. [Autor 1] e [Autor 3] realizaram as análises estatísticas. [Autor 1] redigiu a primeira versão do manuscrito. Todos os autores revisaram criticamente o texto e aprovaram a versão final.</w:t>
+      </w:r>
+    </w:p>
+    <w:p>
+      <w:pPr>
+        <w:spacing w:before="120" w:after="80" w:line="360" w:lineRule="auto"/>
+      </w:pPr>
+      <w:r>
+        <w:rPr>
+          <w:b/>
+          <w:sz w:val="24"/>
+        </w:rPr>
+        <w:t>Financiamento</w:t>
+      </w:r>
+    </w:p>
+    <w:p>
+      <w:pPr>
+        <w:spacing w:line="360" w:lineRule="auto" w:after="120"/>
+        <w:jc w:val="both"/>
+      </w:pPr>
+      <w:r>
+        <w:rPr>
+          <w:b w:val="0"/>
+          <w:sz w:val="24"/>
+        </w:rPr>
+        <w:t>[Esta pesquisa não recebeu financiamento externo. / Esta pesquisa foi financiada por [agência], processo nº [placeholder].]</w:t>
+      </w:r>
+    </w:p>
+    <w:p>
+      <w:pPr>
+        <w:spacing w:before="120" w:after="80" w:line="360" w:lineRule="auto"/>
+      </w:pPr>
+      <w:r>
+        <w:rPr>
+          <w:b/>
+          <w:sz w:val="24"/>
+        </w:rPr>
+        <w:t>Aprovação ética</w:t>
+      </w:r>
+    </w:p>
+    <w:p>
+      <w:pPr>
+        <w:spacing w:line="360" w:lineRule="auto" w:after="120"/>
+        <w:jc w:val="both"/>
+      </w:pPr>
+      <w:r>
+        <w:rPr>
+          <w:b w:val="0"/>
+          <w:sz w:val="24"/>
+        </w:rPr>
+        <w:t>O estudo foi conduzido de acordo com a Declaração de Helsinque e aprovado pelo Comitê de Ética em Pesquisa de [instituição] (parecer nº / CAAE [placeholder]).</w:t>
+      </w:r>
+    </w:p>
+    <w:p>
+      <w:pPr>
+        <w:spacing w:before="120" w:after="80" w:line="360" w:lineRule="auto"/>
+      </w:pPr>
+      <w:r>
+        <w:rPr>
+          <w:b/>
+          <w:sz w:val="24"/>
+        </w:rPr>
+        <w:t>Consentimento informado</w:t>
+      </w:r>
+    </w:p>
+    <w:p>
+      <w:pPr>
+        <w:spacing w:line="360" w:lineRule="auto" w:after="120"/>
+        <w:jc w:val="both"/>
+      </w:pPr>
+      <w:r>
+        <w:rPr>
+          <w:b w:val="0"/>
+          <w:sz w:val="24"/>
+        </w:rPr>
+        <w:t>Todos os participantes assinaram o termo de consentimento livre e esclarecido antes da coleta de dados.</w:t>
+      </w:r>
+    </w:p>
+    <w:p>
+      <w:pPr>
+        <w:spacing w:before="120" w:after="80" w:line="360" w:lineRule="auto"/>
+      </w:pPr>
+      <w:r>
+        <w:rPr>
+          <w:b/>
+          <w:sz w:val="24"/>
+        </w:rPr>
+        <w:t>Disponibilidade dos dados</w:t>
+      </w:r>
+    </w:p>
+    <w:p>
+      <w:pPr>
+        <w:spacing w:line="360" w:lineRule="auto" w:after="120"/>
+        <w:jc w:val="both"/>
+      </w:pPr>
+      <w:r>
+        <w:rPr>
+          <w:b w:val="0"/>
+          <w:sz w:val="24"/>
+        </w:rPr>
+        <w:t>Os dados que sustentam os achados deste estudo, em forma anonimizada, e os scripts de análise estão disponíveis mediante solicitação razoável ao autor correspondente.</w:t>
+      </w:r>
+    </w:p>
+    <w:p>
+      <w:pPr>
+        <w:spacing w:before="120" w:after="80" w:line="360" w:lineRule="auto"/>
+      </w:pPr>
+      <w:r>
+        <w:rPr>
+          <w:b/>
+          <w:sz w:val="24"/>
+        </w:rPr>
+        <w:t>Conflitos de interesse</w:t>
+      </w:r>
+    </w:p>
+    <w:p>
+      <w:pPr>
+        <w:spacing w:line="360" w:lineRule="auto" w:after="120"/>
+        <w:jc w:val="both"/>
+      </w:pPr>
+      <w:r>
+        <w:rPr>
+          <w:b w:val="0"/>
+          <w:sz w:val="24"/>
+        </w:rPr>
+        <w:t>Os autores declaram não haver conflitos de interesse.</w:t>
+      </w:r>
+    </w:p>
+    <w:p>
+      <w:pPr>
+        <w:spacing w:before="120" w:after="80" w:line="360" w:lineRule="auto"/>
+      </w:pPr>
+      <w:r>
+        <w:rPr>
+          <w:b/>
+          <w:sz w:val="24"/>
+        </w:rPr>
+        <w:t>Artigo companheiro</w:t>
+      </w:r>
+    </w:p>
+    <w:p>
+      <w:pPr>
+        <w:spacing w:line="360" w:lineRule="auto" w:after="120"/>
+        <w:jc w:val="both"/>
+      </w:pPr>
+      <w:r>
+        <w:rPr>
+          <w:b w:val="0"/>
+          <w:sz w:val="24"/>
+        </w:rPr>
+        <w:t>Este manuscrito integra um par de estudos-companheiros que compartilham a mesma amostra e o mesmo microciclo, com desfechos primários distintos. O artigo companheiro — sobre os correlatos fisiológicos e de bem-estar da resposta de humor — foi submetido a outro periódico; ambos se citam mutuamente.</w:t>
       </w:r>
     </w:p>
     <w:p>

</xml_diff>

<commit_message>
Revisao de consistencia: referencia faltante e ordem alfabetica
- Acrescenta a referencia THORPE et al. (2017, Int J Sports Physiol
  Perform, DOI 10.1123/ijspp.2016-0434), citada no texto dos dois papers
  mas ausente da lista (verificada no PubMed).
- Corrige a ordenacao alfabetica das referencias do Paper 1
  (ALFONSO antes de ANDRADE; HAMLIN antes de HAN).

Diagnostico automatico dos dois papers apos a correcao: nenhuma tabela ou
figura orfa, nenhuma referencia nao citada, nenhuma citacao sem
referencia, referencias em ordem alfabetica, zero gerundios, leak scan
NONE. Nenhuma analise nova adicionada (papers ja saturados para n=27).

Co-Authored-By: Claude Opus 4.8 <noreply@anthropic.com>
Claude-Session: https://claude.ai/code/session_01P7yGiDeoGDyjWvPWQVsUrj
</commit_message>
<xml_diff>
--- a/Artigos/Paper1_Humor_dinamica.docx
+++ b/Artigos/Paper1_Humor_dinamica.docx
@@ -19612,6 +19612,18 @@
         <w:rPr>
           <w:sz w:val="22"/>
         </w:rPr>
+        <w:t>ALFONSO, C.; CAPDEVILA, L. Heart rate variability, mood and performance: a pilot study on the interrelation of these variables in amateur road cyclists. PeerJ, v. 10, e13094, 2022. DOI: 10.7717/peerj.13094.</w:t>
+      </w:r>
+    </w:p>
+    <w:p>
+      <w:pPr>
+        <w:spacing w:line="360" w:lineRule="auto" w:after="120"/>
+        <w:jc w:val="both"/>
+      </w:pPr>
+      <w:r>
+        <w:rPr>
+          <w:sz w:val="22"/>
+        </w:rPr>
         <w:t>ANDRADE, A. et al. Sleep quality, mood and performance: a study of elite Brazilian volleyball athletes. Journal of Sports Science and Medicine, v. 15, n. 4, p. 601–605, 2016.</w:t>
       </w:r>
     </w:p>
@@ -19637,18 +19649,6 @@
           <w:sz w:val="22"/>
         </w:rPr>
         <w:t>ANDRADE, A. et al. Effect of practice exergames on the mood states and self-esteem of elementary school boys and girls during physical education classes: a cluster-randomized controlled trial. PLoS ONE, v. 15, n. 6, e0232392, 2020. DOI: 10.1371/journal.pone.0232392.</w:t>
-      </w:r>
-    </w:p>
-    <w:p>
-      <w:pPr>
-        <w:spacing w:line="360" w:lineRule="auto" w:after="120"/>
-        <w:jc w:val="both"/>
-      </w:pPr>
-      <w:r>
-        <w:rPr>
-          <w:sz w:val="22"/>
-        </w:rPr>
-        <w:t>ALFONSO, C.; CAPDEVILA, L. Heart rate variability, mood and performance: a pilot study on the interrelation of these variables in amateur road cyclists. PeerJ, v. 10, e13094, 2022. DOI: 10.7717/peerj.13094.</w:t>
       </w:r>
     </w:p>
     <w:p>
@@ -19804,7 +19804,7 @@
         <w:rPr>
           <w:sz w:val="22"/>
         </w:rPr>
-        <w:t>HAN, C.; PARSONS-SMITH, R. L.; TERRY, P. C. Mood profiling in Singapore: cross-cultural validation and potential applications of mood profile clusters. Frontiers in Psychology, v. 11, 665, 2020. DOI: 10.3389/fpsyg.2020.00665.</w:t>
+        <w:t>HAMLIN, M. J. et al. Monitoring training loads and perceived stress in young elite university athletes. Frontiers in Physiology, v. 10, 34, 2019. DOI: 10.3389/fphys.2019.00034.</w:t>
       </w:r>
     </w:p>
     <w:p>
@@ -19816,7 +19816,7 @@
         <w:rPr>
           <w:sz w:val="22"/>
         </w:rPr>
-        <w:t>HAMLIN, M. J. et al. Monitoring training loads and perceived stress in young elite university athletes. Frontiers in Physiology, v. 10, 34, 2019. DOI: 10.3389/fphys.2019.00034.</w:t>
+        <w:t>HAN, C.; PARSONS-SMITH, R. L.; TERRY, P. C. Mood profiling in Singapore: cross-cultural validation and potential applications of mood profile clusters. Frontiers in Psychology, v. 11, 665, 2020. DOI: 10.3389/fpsyg.2020.00665.</w:t>
       </w:r>
     </w:p>
     <w:p>
@@ -20081,6 +20081,18 @@
           <w:sz w:val="22"/>
         </w:rPr>
         <w:t>TERRY, P. C. et al. Mood profiling for sustainable mental health among athletes. Sustainability, v. 13, n. 11, 6116, 2021. DOI: 10.3390/su13116116.</w:t>
+      </w:r>
+    </w:p>
+    <w:p>
+      <w:pPr>
+        <w:spacing w:line="360" w:lineRule="auto" w:after="120"/>
+        <w:jc w:val="both"/>
+      </w:pPr>
+      <w:r>
+        <w:rPr>
+          <w:sz w:val="22"/>
+        </w:rPr>
+        <w:t>THORPE, R. T. et al. Monitoring fatigue status in elite team-sport athletes: implications for practice. International Journal of Sports Physiology and Performance, v. 12, n. S2, p. S227–S234, 2017. DOI: 10.1123/ijspp.2016-0434.</w:t>
       </w:r>
     </w:p>
     <w:p>

</xml_diff>

<commit_message>
Curva da PTH na figura de derivadas; regressao logistica da PTH (fig)
- Figura de derivadas (deriv_poly.png) agora em 3 paineis: vigor, fadiga e
  PTH, cada um com ajuste P(t), derivada P'(t) e ponto de inflexao. Legenda
  do Paper 1 atualizada. Integrado ao texto.
- Regressao logistica da PTH: P(dia de PTH elevada) ~ dia adicionada ao
  compute_logistica.py; figura pth_logistic.png gerada. Resultado HONESTO:
  tendencia positiva mas NAO significativa (OR 1,08/dia; IC95% 0,96-1,25;
  P(D1)=0,30 -> P(D7)=0,41; McFadden 0,004; AUC 0,54). Ainda NAO integrada
  ao texto do manuscrito, aguardando decisao sobre incluir resultado nulo.

Verificacao: zero gerundios, sem tokens residuais, leak scan NONE.

Co-Authored-By: Claude Opus 4.8 <noreply@anthropic.com>
Claude-Session: https://claude.ai/code/session_01P7yGiDeoGDyjWvPWQVsUrj
</commit_message>
<xml_diff>
--- a/Artigos/Paper1_Humor_dinamica.docx
+++ b/Artigos/Paper1_Humor_dinamica.docx
@@ -15943,7 +15943,7 @@
       <w:r>
         <w:drawing>
           <wp:inline xmlns:a="http://schemas.openxmlformats.org/drawingml/2006/main" xmlns:pic="http://schemas.openxmlformats.org/drawingml/2006/picture">
-            <wp:extent cx="5400000" cy="2121429"/>
+            <wp:extent cx="5580000" cy="1573846"/>
             <wp:docPr id="13" name="Picture 13"/>
             <wp:cNvGraphicFramePr>
               <a:graphicFrameLocks noChangeAspect="1"/>
@@ -15964,7 +15964,7 @@
                   <pic:spPr>
                     <a:xfrm>
                       <a:off x="0" y="0"/>
-                      <a:ext cx="5400000" cy="2121429"/>
+                      <a:ext cx="5580000" cy="1573846"/>
                     </a:xfrm>
                     <a:prstGeom prst="rect"/>
                   </pic:spPr>
@@ -15983,7 +15983,7 @@
         <w:rPr>
           <w:sz w:val="22"/>
         </w:rPr>
-        <w:t>Figura 13 – Ajuste polinomial P(t) das médias diárias de vigor e fadiga, com a derivada P′(t) (taxa de variação) e o ponto de inflexão.</w:t>
+        <w:t>Figura 13 – Ajuste polinomial P(t) das médias diárias do vigor, da fadiga e da Perturbação Total do Humor (PTH), com a derivada P′(t) (taxa de variação) e o ponto de inflexão de cada trajetória.</w:t>
       </w:r>
     </w:p>
     <w:p>

</xml_diff>